<commit_message>
docs: sincroniza roteiro de apresentacao com a proposta comercial (duas opcoes e piloto de 30 dias)
</commit_message>
<xml_diff>
--- a/docs/apresentacao/Roteiro_Apresentacao_Sistema_Clinica.docx
+++ b/docs/apresentacao/Roteiro_Apresentacao_Sistema_Clinica.docx
@@ -13,7 +13,7 @@
           <w:color w:val="059669"/>
           <w:sz w:val="18"/>
         </w:rPr>
-        <w:t>GUIA DE CONDUÇÃO COMERCIAL &amp; DEMONSTRAÇÃO PRÁTICA</w:t>
+        <w:t>GUIA DE APRESENTAÇÃO PRÁTICA &amp; FECHAMENTO COMERCIAL</w:t>
       </w:r>
     </w:p>
     <w:p>
@@ -39,9 +39,9 @@
           <w:rFonts w:ascii="Calibri" w:hAnsi="Calibri"/>
           <w:i/>
           <w:color w:val="475569"/>
-          <w:sz w:val="26"/>
+          <w:sz w:val="24"/>
         </w:rPr>
-        <w:t>Clinix — Sistema de Agendamento, Prontuário Eletrônico e Gestão Financeira</w:t>
+        <w:t>Clinix — Demonstração Prática e Fechamento com as Duas Opções (SaaS &amp; Não-SaaS)</w:t>
       </w:r>
     </w:p>
     <w:tbl>
@@ -52,13 +52,13 @@
         <w:tblLook w:firstColumn="1" w:firstRow="1" w:lastColumn="0" w:lastRow="0" w:noHBand="0" w:noVBand="1" w:val="04A0"/>
       </w:tblPr>
       <w:tblGrid>
-        <w:gridCol w:w="4824"/>
-        <w:gridCol w:w="4824"/>
+        <w:gridCol w:w="4896"/>
+        <w:gridCol w:w="4896"/>
       </w:tblGrid>
       <w:tr>
         <w:tc>
           <w:tcPr>
-            <w:tcW w:type="dxa" w:w="4824"/>
+            <w:tcW w:type="dxa" w:w="4896"/>
             <w:shd w:fill="F8FAFC"/>
             <w:tcMar>
               <w:top w:w="80" w:type="dxa"/>
@@ -90,7 +90,7 @@
         </w:tc>
         <w:tc>
           <w:tcPr>
-            <w:tcW w:type="dxa" w:w="4824"/>
+            <w:tcW w:type="dxa" w:w="4896"/>
             <w:shd w:fill="F8FAFC"/>
             <w:tcMar>
               <w:top w:w="80" w:type="dxa"/>
@@ -124,7 +124,7 @@
       <w:tr>
         <w:tc>
           <w:tcPr>
-            <w:tcW w:type="dxa" w:w="4824"/>
+            <w:tcW w:type="dxa" w:w="4896"/>
             <w:shd w:fill="F8FAFC"/>
             <w:tcMar>
               <w:top w:w="80" w:type="dxa"/>
@@ -156,7 +156,7 @@
         </w:tc>
         <w:tc>
           <w:tcPr>
-            <w:tcW w:type="dxa" w:w="4824"/>
+            <w:tcW w:type="dxa" w:w="4896"/>
             <w:shd w:fill="F8FAFC"/>
             <w:tcMar>
               <w:top w:w="80" w:type="dxa"/>
@@ -182,7 +182,7 @@
                 <w:color w:val="475569"/>
                 <w:sz w:val="19"/>
               </w:rPr>
-              <w:t xml:space="preserve"> 1.0 — Outubro / 2026</w:t>
+              <w:t xml:space="preserve"> 2.0 (100% Sincronizada) — Outubro / 2026</w:t>
             </w:r>
           </w:p>
         </w:tc>
@@ -218,7 +218,7 @@
           <w:color w:val="0F172A"/>
           <w:sz w:val="20"/>
         </w:rPr>
-        <w:t>O objetivo desta reunião é transformar o interesse da cliente em confiança sólida e adoção prática do sistema. A apresentação não deve focar apenas em aspectos acadêmicos, mas sim em demonstrar como o sistema resolve os gargalos reais do dia a dia da clínica (faltas de pacientes, agenda encavalada, insegurança jurídica no prontuário e descontrole de pagamentos), evidenciando a maturidade de engenharia de software construída por trás da solução.</w:t>
+        <w:t>O objetivo desta apresentação é transformar o interesse da cliente em confiança sólida e adoção prática do sistema. A reunião não deve focar apenas em aspectos acadêmicos, mas sim em demonstrar como o sistema resolve os gargalos reais da rotina (faltas de pacientes, agenda desorganizada, insegurança jurídica no prontuário e descontrole de pagamentos), conectando a demonstração com uma proposta comercial flexível (Opção 1: Assinatura SaaS vs. Opção 2: Projeto Dedicado Não-SaaS).</w:t>
       </w:r>
     </w:p>
     <w:tbl>
@@ -229,10 +229,10 @@
         <w:tblLook w:firstColumn="1" w:firstRow="1" w:lastColumn="0" w:lastRow="0" w:noHBand="0" w:noVBand="1" w:val="04A0"/>
       </w:tblPr>
       <w:tblGrid>
-        <w:gridCol w:w="2412"/>
-        <w:gridCol w:w="2412"/>
-        <w:gridCol w:w="2412"/>
-        <w:gridCol w:w="2412"/>
+        <w:gridCol w:w="2448"/>
+        <w:gridCol w:w="2448"/>
+        <w:gridCol w:w="2448"/>
+        <w:gridCol w:w="2448"/>
       </w:tblGrid>
       <w:tr>
         <w:tc>
@@ -287,7 +287,7 @@
         </w:tc>
         <w:tc>
           <w:tcPr>
-            <w:tcW w:type="dxa" w:w="4032"/>
+            <w:tcW w:type="dxa" w:w="4176"/>
             <w:shd w:fill="065F46"/>
             <w:tcMar>
               <w:top w:w="100" w:type="dxa"/>
@@ -387,7 +387,7 @@
         </w:tc>
         <w:tc>
           <w:tcPr>
-            <w:tcW w:type="dxa" w:w="4032"/>
+            <w:tcW w:type="dxa" w:w="4176"/>
             <w:shd w:fill="F8FAFC"/>
             <w:tcMar>
               <w:top w:w="80" w:type="dxa"/>
@@ -485,7 +485,7 @@
         </w:tc>
         <w:tc>
           <w:tcPr>
-            <w:tcW w:type="dxa" w:w="4032"/>
+            <w:tcW w:type="dxa" w:w="4176"/>
             <w:shd w:fill="FFFFFF"/>
             <w:tcMar>
               <w:top w:w="80" w:type="dxa"/>
@@ -503,7 +503,7 @@
                 <w:color w:val="0F172A"/>
                 <w:sz w:val="18"/>
               </w:rPr>
-              <w:t>Escuta ativa: mapear as dores reais da cliente</w:t>
+              <w:t>Escuta ativa: mapear as dores reais da clínica</w:t>
             </w:r>
           </w:p>
         </w:tc>
@@ -583,7 +583,7 @@
         </w:tc>
         <w:tc>
           <w:tcPr>
-            <w:tcW w:type="dxa" w:w="4032"/>
+            <w:tcW w:type="dxa" w:w="4176"/>
             <w:shd w:fill="F8FAFC"/>
             <w:tcMar>
               <w:top w:w="80" w:type="dxa"/>
@@ -681,7 +681,7 @@
         </w:tc>
         <w:tc>
           <w:tcPr>
-            <w:tcW w:type="dxa" w:w="4032"/>
+            <w:tcW w:type="dxa" w:w="4176"/>
             <w:shd w:fill="FFFFFF"/>
             <w:tcMar>
               <w:top w:w="80" w:type="dxa"/>
@@ -779,7 +779,7 @@
         </w:tc>
         <w:tc>
           <w:tcPr>
-            <w:tcW w:type="dxa" w:w="4032"/>
+            <w:tcW w:type="dxa" w:w="4176"/>
             <w:shd w:fill="F8FAFC"/>
             <w:tcMar>
               <w:top w:w="80" w:type="dxa"/>
@@ -871,13 +871,13 @@
                 <w:color w:val="0F172A"/>
                 <w:sz w:val="18"/>
               </w:rPr>
-              <w:t>Feedback &amp; Fechamento</w:t>
+              <w:t>Proposta Comercial &amp; Fechamento</w:t>
             </w:r>
           </w:p>
         </w:tc>
         <w:tc>
           <w:tcPr>
-            <w:tcW w:type="dxa" w:w="4032"/>
+            <w:tcW w:type="dxa" w:w="4176"/>
             <w:shd w:fill="FFFFFF"/>
             <w:tcMar>
               <w:top w:w="80" w:type="dxa"/>
@@ -895,7 +895,7 @@
                 <w:color w:val="0F172A"/>
                 <w:sz w:val="18"/>
               </w:rPr>
-              <w:t>Coleta de impressões, adaptações e teste piloto</w:t>
+              <w:t>Apresentação das Duas Portas (SaaS vs Não-SaaS) e piloto</w:t>
             </w:r>
           </w:p>
         </w:tc>
@@ -965,7 +965,7 @@
           <w:color w:val="0F172A"/>
           <w:sz w:val="20"/>
         </w:rPr>
-        <w:t xml:space="preserve"> Abra o arquivo index.html em navegador moderno (Chrome, Edge ou Firefox). Pressione F11 para entrar em tela cheia sem distrações de abas ou barras de favoritos.</w:t>
+        <w:t xml:space="preserve"> Abra o arquivo index.html em navegador moderno (Chrome, Edge ou Firefox). Pressione F11 para entrar em tela cheia sem distrações.</w:t>
       </w:r>
     </w:p>
     <w:p>
@@ -1026,6 +1026,29 @@
           <w:color w:val="0F172A"/>
           <w:sz w:val="20"/>
         </w:rPr>
+        <w:t>Documentos Comerciais:</w:t>
+      </w:r>
+      <w:r>
+        <w:rPr>
+          <w:rFonts w:ascii="Calibri" w:hAnsi="Calibri"/>
+          <w:color w:val="0F172A"/>
+          <w:sz w:val="20"/>
+        </w:rPr>
+        <w:t xml:space="preserve"> Tenha aberto ou impresso o documento da Proposta Comercial com a Minuta de Adesão.</w:t>
+      </w:r>
+    </w:p>
+    <w:p>
+      <w:pPr>
+        <w:pStyle w:val="ListBullet"/>
+        <w:spacing w:after="60" w:line="276" w:lineRule="auto"/>
+      </w:pPr>
+      <w:r>
+        <w:rPr>
+          <w:rFonts w:ascii="Calibri" w:hAnsi="Calibri"/>
+          <w:b/>
+          <w:color w:val="0F172A"/>
+          <w:sz w:val="20"/>
+        </w:rPr>
         <w:t>Bloco de Notas:</w:t>
       </w:r>
       <w:r>
@@ -1034,7 +1057,7 @@
           <w:color w:val="0F172A"/>
           <w:sz w:val="20"/>
         </w:rPr>
-        <w:t xml:space="preserve"> Mantenha um bloco à mão para anotar termos específicos da rotina dela (ex.: 'anamnese', 'evolução', 'sessão').</w:t>
+        <w:t xml:space="preserve"> Mantenha um bloco à mão para anotar termos específicos da rotina dela (ex.: 'anamnese', 'evolução').</w:t>
       </w:r>
     </w:p>
     <w:p>
@@ -1057,7 +1080,7 @@
           <w:color w:val="0F172A"/>
           <w:sz w:val="20"/>
         </w:rPr>
-        <w:t xml:space="preserve"> Ouça com atenção antes de sair mostrando telas. A postura de quem resolve problemas transmite muito mais autoridade do que apenas tentar vender.</w:t>
+        <w:t xml:space="preserve"> Ouça com atenção antes de sair mostrando telas. Postura consultiva transmite autoridade.</w:t>
       </w:r>
     </w:p>
     <w:p>
@@ -1329,7 +1352,7 @@
           <w:color w:val="0F172A"/>
           <w:sz w:val="20"/>
         </w:rPr>
-        <w:t>Aqui você compartilha a tela com a aplicação interativa aberta (index.html). Siga a sequência natural do atendimento médico/clínico (o fluxo TO-BE da clínica):</w:t>
+        <w:t>Compartilhe a tela com a aplicação interativa aberta (index.html), seguindo a jornada real da clínica:</w:t>
       </w:r>
     </w:p>
     <w:p>
@@ -1396,7 +1419,7 @@
           <w:color w:val="0F172A"/>
           <w:sz w:val="19"/>
         </w:rPr>
-        <w:t>"Logo no início da manhã, ao abrir o sistema, você tem a fotografia completa do seu dia: quantos pacientes vai atender, horários, quem já confirmou e alertas prioritários. Tudo em uma única tela limpa, sem precisar folhear cadernos ou abrir várias planilhas."</w:t>
+        <w:t>"Logo no início da manhã, ao abrir o sistema, você tem a fotografia completa do seu dia: quantos pacientes vai atender, horários, quem já confirmou e alertas prioritários. Tudo em uma única tela limpa, sem precisar folhear cadernos."</w:t>
       </w:r>
     </w:p>
     <w:p>
@@ -1426,29 +1449,6 @@
           <w:color w:val="0F172A"/>
           <w:sz w:val="20"/>
         </w:rPr>
-        <w:t>Navegação:</w:t>
-      </w:r>
-      <w:r>
-        <w:rPr>
-          <w:rFonts w:ascii="Calibri" w:hAnsi="Calibri"/>
-          <w:color w:val="0F172A"/>
-          <w:sz w:val="20"/>
-        </w:rPr>
-        <w:t xml:space="preserve"> Clique na aba 'Agenda Clínica'.</w:t>
-      </w:r>
-    </w:p>
-    <w:p>
-      <w:pPr>
-        <w:pStyle w:val="ListBullet"/>
-        <w:spacing w:after="60" w:line="276" w:lineRule="auto"/>
-      </w:pPr>
-      <w:r>
-        <w:rPr>
-          <w:rFonts w:ascii="Calibri" w:hAnsi="Calibri"/>
-          <w:b/>
-          <w:color w:val="0F172A"/>
-          <w:sz w:val="20"/>
-        </w:rPr>
         <w:t>Ação A (3 Cliques):</w:t>
       </w:r>
       <w:r>
@@ -1457,7 +1457,7 @@
           <w:color w:val="0F172A"/>
           <w:sz w:val="20"/>
         </w:rPr>
-        <w:t xml:space="preserve"> Clique em um horário vago (ex.: 10:00), selecione a paciente e confirme a consulta em poucos segundos.</w:t>
+        <w:t xml:space="preserve"> Clique na aba 'Agenda Clínica' e marque uma consulta em 3 cliques.</w:t>
       </w:r>
     </w:p>
     <w:p>
@@ -1480,7 +1480,7 @@
           <w:color w:val="0F172A"/>
           <w:sz w:val="20"/>
         </w:rPr>
-        <w:t xml:space="preserve"> Tente propositalmente agendar outro paciente exatamente no mesmo horário das 10:00. Mostre o bloqueio imediato do sistema.</w:t>
+        <w:t xml:space="preserve"> Tente propositalmente agendar outro paciente exatamente no mesmo horário para exibir o bloqueio inteligente.</w:t>
       </w:r>
     </w:p>
     <w:p>
@@ -1509,7 +1509,7 @@
           <w:color w:val="0F172A"/>
           <w:sz w:val="19"/>
         </w:rPr>
-        <w:t>"Aqui está uma das maiores proteções do sistema: se você ou sua recepcionista tentar agendar dois pacientes no mesmo horário por engano, o sistema impede a gravação e alerta na hora. Isso elimina aquele constrangimento de pacientes esperando ao mesmo tempo na recepção."</w:t>
+        <w:t>"Aqui está uma das maiores proteções do sistema: se você ou sua recepcionista tentar agendar dois pacientes no mesmo horário por engano, o sistema impede a gravação e alerta na hora. Isso elimina o constrangimento de pacientes esperando ao mesmo tempo na recepção."</w:t>
       </w:r>
     </w:p>
     <w:p>
@@ -1547,30 +1547,7 @@
           <w:color w:val="0F172A"/>
           <w:sz w:val="20"/>
         </w:rPr>
-        <w:t xml:space="preserve"> Aponte o ícone de status de notificação e o lembrete programado ao lado do agendamento.</w:t>
-      </w:r>
-    </w:p>
-    <w:p>
-      <w:pPr>
-        <w:pStyle w:val="ListBullet"/>
-        <w:spacing w:after="60" w:line="276" w:lineRule="auto"/>
-      </w:pPr>
-      <w:r>
-        <w:rPr>
-          <w:rFonts w:ascii="Calibri" w:hAnsi="Calibri"/>
-          <w:b/>
-          <w:color w:val="0F172A"/>
-          <w:sz w:val="20"/>
-        </w:rPr>
-        <w:t>Ação Extra (Cancelamento Tardio):</w:t>
-      </w:r>
-      <w:r>
-        <w:rPr>
-          <w:rFonts w:ascii="Calibri" w:hAnsi="Calibri"/>
-          <w:color w:val="0F172A"/>
-          <w:sz w:val="20"/>
-        </w:rPr>
-        <w:t xml:space="preserve"> Mostre como o sistema detecta cancelamentos feitos com menos de 24 horas e sinaliza na ficha.</w:t>
+        <w:t xml:space="preserve"> Aponte o ícone de status de mensagem e lembrete programado ao lado da consulta.</w:t>
       </w:r>
     </w:p>
     <w:p>
@@ -1599,7 +1576,7 @@
           <w:color w:val="0F172A"/>
           <w:sz w:val="19"/>
         </w:rPr>
-        <w:t>"Assim que a consulta é confirmada, o sistema prepara o disparo de confirmação no WhatsApp do paciente e já programa o lembrete automático 24 horas antes. Essa comunicação simples reduz as faltas e os esquecimentos em até 40%. E se o paciente cancelar de última hora, o sistema registra como cancelamento tardio para controle."</w:t>
+        <w:t>"Assim que a consulta é confirmada, o sistema prepara o disparo de confirmação no WhatsApp do paciente e já programa o lembrete 24 horas antes. Essa comunicação simples reduz as faltas e esquecimentos em até 40%."</w:t>
       </w:r>
     </w:p>
     <w:p>
@@ -1637,7 +1614,7 @@
           <w:color w:val="0F172A"/>
           <w:sz w:val="20"/>
         </w:rPr>
-        <w:t xml:space="preserve"> Abra a aba 'Prontuário Eletrônico' (ou use a busca rápida Ctrl + K para achar o paciente).</w:t>
+        <w:t xml:space="preserve"> Abra a aba 'Prontuário Eletrônico' (atalho Ctrl + K) e selecione a paciente Mariana Duarte.</w:t>
       </w:r>
     </w:p>
     <w:p>
@@ -1652,7 +1629,7 @@
           <w:color w:val="0F172A"/>
           <w:sz w:val="20"/>
         </w:rPr>
-        <w:t>Ação A (Ficha e Alergias):</w:t>
+        <w:t>Ação (Versionamento):</w:t>
       </w:r>
       <w:r>
         <w:rPr>
@@ -1660,30 +1637,7 @@
           <w:color w:val="0F172A"/>
           <w:sz w:val="20"/>
         </w:rPr>
-        <w:t xml:space="preserve"> Mostre o cabeçalho clínico com alertas destacados de alergias e condições pré-existentes, além da linha do tempo cronológica.</w:t>
-      </w:r>
-    </w:p>
-    <w:p>
-      <w:pPr>
-        <w:pStyle w:val="ListBullet"/>
-        <w:spacing w:after="60" w:line="276" w:lineRule="auto"/>
-      </w:pPr>
-      <w:r>
-        <w:rPr>
-          <w:rFonts w:ascii="Calibri" w:hAnsi="Calibri"/>
-          <w:b/>
-          <w:color w:val="0F172A"/>
-          <w:sz w:val="20"/>
-        </w:rPr>
-        <w:t>Ação B (Versionamento Imutável):</w:t>
-      </w:r>
-      <w:r>
-        <w:rPr>
-          <w:rFonts w:ascii="Calibri" w:hAnsi="Calibri"/>
-          <w:color w:val="0F172A"/>
-          <w:sz w:val="20"/>
-        </w:rPr>
-        <w:t xml:space="preserve"> Clique em editar uma anotação, altere o texto informando o motivo da mudança e abra a aba 'Histórico de Versões'.</w:t>
+        <w:t xml:space="preserve"> Altere uma anotação informando o motivo e mostre a aba 'Histórico de Versões' com o registro antigo preservado.</w:t>
       </w:r>
     </w:p>
     <w:p>
@@ -1712,7 +1666,7 @@
           <w:color w:val="0F172A"/>
           <w:sz w:val="19"/>
         </w:rPr>
-        <w:t>"Este é um dos recursos mais avançados e importantes para o profissional de saúde: o respaldo ético e jurídico. Em blocos de notas ou sistemas comuns, ao editar uma anotação antiga, o texto anterior se perde. No Clinix, cada alteração cria uma versão arquivada permanente com data, hora e motivo. Isso dá segurança absoluta perante conselhos de classe (CRM, CRP, etc.) e resguardo total em qualquer questão judicial."</w:t>
+        <w:t>"Este é um dos recursos mais avançados e importantes para o profissional de saúde: o respaldo ético e legal. No Clinix, cada alteração cria uma versão arquivada definitiva com data e motivo. Isso dá segurança absoluta perante conselhos de classe e resguardo total em qualquer questão judicial."</w:t>
       </w:r>
     </w:p>
     <w:p>
@@ -1742,7 +1696,7 @@
           <w:color w:val="0F172A"/>
           <w:sz w:val="20"/>
         </w:rPr>
-        <w:t>Navegação:</w:t>
+        <w:t>Ação:</w:t>
       </w:r>
       <w:r>
         <w:rPr>
@@ -1750,53 +1704,7 @@
           <w:color w:val="0F172A"/>
           <w:sz w:val="20"/>
         </w:rPr>
-        <w:t xml:space="preserve"> Navegue até a aba 'Financeiro &amp; Relatórios'.</w:t>
-      </w:r>
-    </w:p>
-    <w:p>
-      <w:pPr>
-        <w:pStyle w:val="ListBullet"/>
-        <w:spacing w:after="60" w:line="276" w:lineRule="auto"/>
-      </w:pPr>
-      <w:r>
-        <w:rPr>
-          <w:rFonts w:ascii="Calibri" w:hAnsi="Calibri"/>
-          <w:b/>
-          <w:color w:val="0F172A"/>
-          <w:sz w:val="20"/>
-        </w:rPr>
-        <w:t>Ação A (Baixa em 1 clique):</w:t>
-      </w:r>
-      <w:r>
-        <w:rPr>
-          <w:rFonts w:ascii="Calibri" w:hAnsi="Calibri"/>
-          <w:color w:val="0F172A"/>
-          <w:sz w:val="20"/>
-        </w:rPr>
-        <w:t xml:space="preserve"> Dê baixa em uma consulta pendente selecionando a forma de pagamento (Pix, Cartão ou Dinheiro).</w:t>
-      </w:r>
-    </w:p>
-    <w:p>
-      <w:pPr>
-        <w:pStyle w:val="ListBullet"/>
-        <w:spacing w:after="60" w:line="276" w:lineRule="auto"/>
-      </w:pPr>
-      <w:r>
-        <w:rPr>
-          <w:rFonts w:ascii="Calibri" w:hAnsi="Calibri"/>
-          <w:b/>
-          <w:color w:val="0F172A"/>
-          <w:sz w:val="20"/>
-        </w:rPr>
-        <w:t>Ação B (Resumo do Mês):</w:t>
-      </w:r>
-      <w:r>
-        <w:rPr>
-          <w:rFonts w:ascii="Calibri" w:hAnsi="Calibri"/>
-          <w:color w:val="0F172A"/>
-          <w:sz w:val="20"/>
-        </w:rPr>
-        <w:t xml:space="preserve"> Aponte o resumo mensal consolidando atendimentos realizados, faturamento total e valores ainda pendentes.</w:t>
+        <w:t xml:space="preserve"> Navegue até 'Financeiro &amp; Relatórios' e dê baixa com Pix/Cartão.</w:t>
       </w:r>
     </w:p>
     <w:p>
@@ -1825,7 +1733,7 @@
           <w:color w:val="0F172A"/>
           <w:sz w:val="19"/>
         </w:rPr>
-        <w:t>"No final da consulta, com um clique você dá baixa informando se foi Pix, cartão ou dinheiro. Se o paciente for acertar depois, o valor permanece visível na lista de pendências. No final do mês, você não precisa somar extratos ou recibos: o sistema fecha o faturamento automaticamente."</w:t>
+        <w:t>"No final da consulta, com um clique você dá baixa informando se foi Pix, cartão ou dinheiro. No final do mês, você não precisa somar extratos: o sistema fecha o faturamento automaticamente."</w:t>
       </w:r>
     </w:p>
     <w:p>
@@ -1892,7 +1800,7 @@
           <w:color w:val="0F172A"/>
           <w:sz w:val="19"/>
         </w:rPr>
-        <w:t>"O sistema separa estritamente quem pode ver o quê. Se você tiver uma recepcionista, ela pode agendar, emitir recibos e cadastrar pacientes, mas ela não tem acesso ao prontuário médico sigiloso, que fica restrito ao profissional de saúde. Além disso, cada acesso a prontuário gera log de auditoria, e o cadastro permite anonimização imediata para atender a LGPD."</w:t>
+        <w:t>"O sistema separa estritamente quem pode ver o quê. A recepcionista pode agendar e dar baixas, mas não tem acesso ao prontuário médico sigiloso. Além disso, cada acesso gera log de auditoria e o cadastro permite anonimização imediata para atender à LGPD."</w:t>
       </w:r>
     </w:p>
     <w:p>
@@ -1920,7 +1828,7 @@
           <w:color w:val="0F172A"/>
           <w:sz w:val="20"/>
         </w:rPr>
-        <w:t>Neste momento, você posiciona o projeto com extrema seriedade e transparência técnica, destacando que não se trata de uma ideia teórica, mas de um software construído com práticas profissionais de engenharia:</w:t>
+        <w:t>Neste momento, você posiciona o projeto com seriedade técnica, destacando que é um software construído com rigor de engenharia:</w:t>
       </w:r>
     </w:p>
     <w:tbl>
@@ -1931,9 +1839,9 @@
         <w:tblLook w:firstColumn="1" w:firstRow="1" w:lastColumn="0" w:lastRow="0" w:noHBand="0" w:noVBand="1" w:val="04A0"/>
       </w:tblPr>
       <w:tblGrid>
-        <w:gridCol w:w="3216"/>
-        <w:gridCol w:w="3216"/>
-        <w:gridCol w:w="3216"/>
+        <w:gridCol w:w="3264"/>
+        <w:gridCol w:w="3264"/>
+        <w:gridCol w:w="3264"/>
       </w:tblGrid>
       <w:tr>
         <w:tc>
@@ -2245,35 +2153,6 @@
     </w:p>
     <w:p>
       <w:pPr>
-        <w:spacing w:before="80" w:after="120"/>
-        <w:ind w:left="288" w:right="288"/>
-        <w:pBdr>
-          <w:left w:val="single" w:sz="24" w:space="12" w:color="059669"/>
-        </w:pBdr>
-        <w:shd w:fill="F0FDF4"/>
-      </w:pPr>
-      <w:r>
-        <w:rPr>
-          <w:rFonts w:ascii="Calibri" w:hAnsi="Calibri"/>
-          <w:b/>
-          <w:color w:val="065F46"/>
-          <w:sz w:val="19"/>
-        </w:rPr>
-        <w:t>🗣️ Explicação do Andamento e Solidez Técnica</w:t>
-        <w:br/>
-      </w:r>
-      <w:r>
-        <w:rPr>
-          <w:rFonts w:ascii="Calibri" w:hAnsi="Calibri"/>
-          <w:i/>
-          <w:color w:val="0F172A"/>
-          <w:sz w:val="19"/>
-        </w:rPr>
-        <w:t>"Para que você tenha total clareza do nosso rigor: nós não começamos apenas desenhando telas. Desenvolvemos primeiro o núcleo com a metodologia TDD (Test-Driven Development) em C# (.NET 8). Já temos 23 testes automatizados garantindo que nenhuma regra falhe — desde a detecção de conflitos de horário até a anonimização da LGPD. O protótipo que você acabou de ver já está validando a experiência de uso, e o nosso próximo passo é finalizar a integração com o banco de dados dedicado na nuvem com rotina de backup diário."</w:t>
-      </w:r>
-    </w:p>
-    <w:p>
-      <w:pPr>
         <w:keepNext/>
         <w:spacing w:before="280" w:after="80"/>
       </w:pPr>
@@ -2284,7 +2163,7 @@
           <w:color w:val="065F46"/>
           <w:sz w:val="28"/>
         </w:rPr>
-        <w:t>7. Bloco 5: Coleta de Feedback e Fechamento Comercial (5 a 10 min)</w:t>
+        <w:t>7. Bloco 5: Proposta Comercial e Fechamento (5 a 10 min)</w:t>
       </w:r>
     </w:p>
     <w:p>
@@ -2297,91 +2176,7 @@
           <w:color w:val="0F172A"/>
           <w:sz w:val="20"/>
         </w:rPr>
-        <w:t>Conclua a reunião transformando a cliente em parceira de validação do projeto (co-autora da solução):</w:t>
-      </w:r>
-    </w:p>
-    <w:p>
-      <w:pPr>
-        <w:keepNext/>
-        <w:spacing w:before="200" w:after="60"/>
-      </w:pPr>
-      <w:r>
-        <w:rPr>
-          <w:rFonts w:ascii="Calibri" w:hAnsi="Calibri"/>
-          <w:b/>
-          <w:color w:val="059669"/>
-          <w:sz w:val="23"/>
-        </w:rPr>
-        <w:t>Perguntas de Fechamento:</w:t>
-      </w:r>
-    </w:p>
-    <w:p>
-      <w:pPr>
-        <w:pStyle w:val="ListBullet"/>
-        <w:spacing w:after="60" w:line="276" w:lineRule="auto"/>
-      </w:pPr>
-      <w:r>
-        <w:rPr>
-          <w:rFonts w:ascii="Calibri" w:hAnsi="Calibri"/>
-          <w:b/>
-          <w:color w:val="0F172A"/>
-          <w:sz w:val="20"/>
-        </w:rPr>
-        <w:t>Impressão Geral:</w:t>
-      </w:r>
-      <w:r>
-        <w:rPr>
-          <w:rFonts w:ascii="Calibri" w:hAnsi="Calibri"/>
-          <w:color w:val="0F172A"/>
-          <w:sz w:val="20"/>
-        </w:rPr>
-        <w:t xml:space="preserve"> 'Olhando o fluxo que demonstramos agora, como você enxerga isso funcionando na rotina real do seu consultório?'</w:t>
-      </w:r>
-    </w:p>
-    <w:p>
-      <w:pPr>
-        <w:pStyle w:val="ListBullet"/>
-        <w:spacing w:after="60" w:line="276" w:lineRule="auto"/>
-      </w:pPr>
-      <w:r>
-        <w:rPr>
-          <w:rFonts w:ascii="Calibri" w:hAnsi="Calibri"/>
-          <w:b/>
-          <w:color w:val="0F172A"/>
-          <w:sz w:val="20"/>
-        </w:rPr>
-        <w:t>Destaque Principal:</w:t>
-      </w:r>
-      <w:r>
-        <w:rPr>
-          <w:rFonts w:ascii="Calibri" w:hAnsi="Calibri"/>
-          <w:color w:val="0F172A"/>
-          <w:sz w:val="20"/>
-        </w:rPr>
-        <w:t xml:space="preserve"> 'Teve alguma tela ou recurso que chamou mais a sua atenção?'</w:t>
-      </w:r>
-    </w:p>
-    <w:p>
-      <w:pPr>
-        <w:pStyle w:val="ListBullet"/>
-        <w:spacing w:after="60" w:line="276" w:lineRule="auto"/>
-      </w:pPr>
-      <w:r>
-        <w:rPr>
-          <w:rFonts w:ascii="Calibri" w:hAnsi="Calibri"/>
-          <w:b/>
-          <w:color w:val="0F172A"/>
-          <w:sz w:val="20"/>
-        </w:rPr>
-        <w:t>Adaptações Específicas:</w:t>
-      </w:r>
-      <w:r>
-        <w:rPr>
-          <w:rFonts w:ascii="Calibri" w:hAnsi="Calibri"/>
-          <w:color w:val="0F172A"/>
-          <w:sz w:val="20"/>
-        </w:rPr>
-        <w:t xml:space="preserve"> 'Na sua especialidade, existe algum campo clínico ou modelo de documento específico (ex.: anamnese personalizada ou recibo) que seria indispensável no seu primeiro dia de uso?'</w:t>
+        <w:t>Conclua a reunião apresentando a proposta comercial 100% alinhada com as Duas Opções de Contratação (SaaS vs Não-SaaS):</w:t>
       </w:r>
     </w:p>
     <w:p>
@@ -2400,7 +2195,7 @@
           <w:color w:val="065F46"/>
           <w:sz w:val="19"/>
         </w:rPr>
-        <w:t>🗣️ Chamada para Ação (Proposta de Piloto)</w:t>
+        <w:t>🗣️ Script de Apresentação das Duas Opções &amp; Fechamento</w:t>
         <w:br/>
       </w:r>
       <w:r>
@@ -2410,7 +2205,104 @@
           <w:color w:val="0F172A"/>
           <w:sz w:val="19"/>
         </w:rPr>
-        <w:t>"O nosso próximo passo ideal é cadastrar as configurações do seu consultório — seus horários de atendimento, serviços e valores — e liberar um período de testes piloto de 15 dias para você experimentar na prática e nos dar suas impressões. O que acha de alinharmos os dados para iniciarmos esse piloto?"</w:t>
+        <w:t>"Dra. [Nome], agora que você viu como o sistema funciona na prática, quero te apresentar como nós estruturamos a contratação. Para que você tenha total conforto financeiro e escolha o que melhor se adapta à gestão da sua clínica hoje, nós trabalhamos com dois formatos:</w:t>
+        <w:br/>
+        <w:br/>
+        <w:t>Opção 1 — Assinatura Leve (Plano Parceiro Fundador):</w:t>
+        <w:br/>
+        <w:t>Você não paga nada de taxa de desenvolvimento. Nós liberamos 30 dias de uso piloto gratuito no seu consultório para você e sua equipe testarem na rotina real. Se você aprovar os resultados, você mantém uma mensalidade especial fixada de apenas R$ 119,00 por mês [ou R$ 97,00], com servidores em nuvem, backups diários de segurança, suporte direto comigo e todas as novas atualizações inclusas, sem taxa de cancelamento.</w:t>
+        <w:br/>
+        <w:br/>
+        <w:t>Opção 2 — Projeto Dedicado do Consultório (Sem Mensalidades):</w:t>
+        <w:br/>
+        <w:t>Se você prefere não ter mensalidades fixas e quer que o sistema seja um investimento próprio do consultório, nós fazemos a entrega como um projeto fechado por R$ 2.400,00. Nós dividimos esse valor em etapas conforme as entregas: 40% de entrada, 30% na validação dos dados reais e 30% após o treinamento da equipe. Essa opção inclui a instalação exclusiva, importação dos seus pacientes e 90 dias de garantia técnica total, sem mensalidades obrigatórias.</w:t>
+        <w:br/>
+        <w:br/>
+        <w:t>Dra. [Nome], considerando a rotina e o momento atual do seu consultório, qual desses dois formatos faz mais sentido para você começar?"</w:t>
+      </w:r>
+    </w:p>
+    <w:p>
+      <w:pPr>
+        <w:keepNext/>
+        <w:spacing w:before="200" w:after="60"/>
+      </w:pPr>
+      <w:r>
+        <w:rPr>
+          <w:rFonts w:ascii="Calibri" w:hAnsi="Calibri"/>
+          <w:b/>
+          <w:color w:val="059669"/>
+          <w:sz w:val="23"/>
+        </w:rPr>
+        <w:t>Como Conduzir as Respostas da Cliente:</w:t>
+      </w:r>
+    </w:p>
+    <w:p>
+      <w:pPr>
+        <w:pStyle w:val="ListBullet"/>
+        <w:spacing w:after="60" w:line="276" w:lineRule="auto"/>
+      </w:pPr>
+      <w:r>
+        <w:rPr>
+          <w:rFonts w:ascii="Calibri" w:hAnsi="Calibri"/>
+          <w:b/>
+          <w:color w:val="0F172A"/>
+          <w:sz w:val="20"/>
+        </w:rPr>
+        <w:t>Se escolher a Opção 1 (SaaS / Piloto):</w:t>
+      </w:r>
+      <w:r>
+        <w:rPr>
+          <w:rFonts w:ascii="Calibri" w:hAnsi="Calibri"/>
+          <w:color w:val="0F172A"/>
+          <w:sz w:val="20"/>
+        </w:rPr>
+        <w:t xml:space="preserve"> 'Excelente! O piloto de 30 dias é a melhor forma de você sentir o ganho de tempo sem nenhum risco. Vou coletar seus horários e serviços para parametrizar o sistema e na próxima semana já liberamos o seu acesso para você começar a usar.'</w:t>
+      </w:r>
+    </w:p>
+    <w:p>
+      <w:pPr>
+        <w:pStyle w:val="ListBullet"/>
+        <w:spacing w:after="60" w:line="276" w:lineRule="auto"/>
+      </w:pPr>
+      <w:r>
+        <w:rPr>
+          <w:rFonts w:ascii="Calibri" w:hAnsi="Calibri"/>
+          <w:b/>
+          <w:color w:val="0F172A"/>
+          <w:sz w:val="20"/>
+        </w:rPr>
+        <w:t>Se escolher a Opção 2 (Projeto Fechado):</w:t>
+      </w:r>
+      <w:r>
+        <w:rPr>
+          <w:rFonts w:ascii="Calibri" w:hAnsi="Calibri"/>
+          <w:color w:val="0F172A"/>
+          <w:sz w:val="20"/>
+        </w:rPr>
+        <w:t xml:space="preserve"> 'Perfeito! Vou emitir o nosso termo de projeto com o cronograma das três entregas e o detalhamento da garantia de 90 dias. Podemos programar a entrada para [data de preferência dela] para iniciarmos a configuração?'</w:t>
+      </w:r>
+    </w:p>
+    <w:p>
+      <w:pPr>
+        <w:pStyle w:val="ListBullet"/>
+        <w:spacing w:after="60" w:line="276" w:lineRule="auto"/>
+      </w:pPr>
+      <w:r>
+        <w:rPr>
+          <w:rFonts w:ascii="Calibri" w:hAnsi="Calibri"/>
+          <w:b/>
+          <w:color w:val="0F172A"/>
+          <w:sz w:val="20"/>
+        </w:rPr>
+        <w:t>Se ela hesitar ('Preciso pensar...'):</w:t>
+      </w:r>
+      <w:r>
+        <w:rPr>
+          <w:rFonts w:ascii="Calibri" w:hAnsi="Calibri"/>
+          <w:color w:val="0F172A"/>
+          <w:sz w:val="20"/>
+        </w:rPr>
+        <w:t xml:space="preserve"> 'Compreendo perfeitamente, Dra. [Nome]! Para você não precisar tomar nenhuma decisão financeira hoje, o que acha de aproveitarmos os 30 dias de piloto gratuito da Opção 1? Você usa o sistema no consultório neste mês e, no final dos 30 dias, você decide com calma se prefere continuar na assinatura ou converter para o projeto fechado. O que acha?'</w:t>
       </w:r>
     </w:p>
     <w:p>
@@ -2425,7 +2317,7 @@
           <w:color w:val="065F46"/>
           <w:sz w:val="28"/>
         </w:rPr>
-        <w:t>8. Guia de Respostas para Objeções e Dúvidas Comuns</w:t>
+        <w:t>8. Guia de Respostas para Objeções de Preço e Técnicas</w:t>
       </w:r>
     </w:p>
     <w:tbl>
@@ -2436,8 +2328,8 @@
         <w:tblLook w:firstColumn="1" w:firstRow="1" w:lastColumn="0" w:lastRow="0" w:noHBand="0" w:noVBand="1" w:val="04A0"/>
       </w:tblPr>
       <w:tblGrid>
-        <w:gridCol w:w="4824"/>
-        <w:gridCol w:w="4824"/>
+        <w:gridCol w:w="4896"/>
+        <w:gridCol w:w="4896"/>
       </w:tblGrid>
       <w:tr>
         <w:tc>
@@ -2458,7 +2350,7 @@
                 <w:color w:val="FFFFFF"/>
                 <w:sz w:val="18"/>
               </w:rPr>
-              <w:t>Dúvida / Objeção da Cliente</w:t>
+              <w:t>Objeção da Cliente</w:t>
             </w:r>
           </w:p>
         </w:tc>
@@ -2504,7 +2396,7 @@
                 <w:color w:val="0F172A"/>
                 <w:sz w:val="18"/>
               </w:rPr>
-              <w:t>E se a internet cair durante um atendimento?</w:t>
+              <w:t>No Modelo Fechado: 'Achei R$ 2.400 pesado para pagar agora'</w:t>
             </w:r>
           </w:p>
         </w:tc>
@@ -2525,7 +2417,7 @@
                 <w:color w:val="475569"/>
                 <w:sz w:val="18"/>
               </w:rPr>
-              <w:t>O sistema é leve e opera com armazenamento temporário seguro no navegador. Em caso de oscilações pontuais, seus registros na tela permanecem preservados.</w:t>
+              <w:t>Compreendo perfeitamente! É exatamente por isso que nós temos a Opção 1 de Assinatura. Você não desembolsa absolutamente nada agora, ganha 30 dias de piloto gratuito e depois mantém apenas R$ 119,00 por mês, que é menos que o valor de uma única consulta particular da sua clínica.</w:t>
             </w:r>
           </w:p>
         </w:tc>
@@ -2549,7 +2441,7 @@
                 <w:color w:val="0F172A"/>
                 <w:sz w:val="18"/>
               </w:rPr>
-              <w:t>Consigo acessar pelo celular ou tablet?</w:t>
+              <w:t>No Modelo SaaS: 'Não gosto de pagar mensalidade pra sempre'</w:t>
             </w:r>
           </w:p>
         </w:tc>
@@ -2570,7 +2462,7 @@
                 <w:color w:val="475569"/>
                 <w:sz w:val="18"/>
               </w:rPr>
-              <w:t>Sim! A interface é 100% responsiva. Você pode consultar a agenda, confirmar consultas ou verificar prontuários tanto no computador do consultório quanto no celular.</w:t>
+              <w:t>Sem problemas! Nós podemos formalizar a entrega como Projeto Fechado por R$ 2.400,00 (divididos em 3 etapas de entrega), com 90 dias de garantia técnica inclusa e sem qualquer cobrança mensal obrigatória.</w:t>
             </w:r>
           </w:p>
         </w:tc>
@@ -2594,7 +2486,7 @@
                 <w:color w:val="0F172A"/>
                 <w:sz w:val="18"/>
               </w:rPr>
-              <w:t>Meus dados e prontuários estão protegidos contra vazamento?</w:t>
+              <w:t>Em Qualquer Modelo: 'Por que não é de graça se é de faculdade?'</w:t>
             </w:r>
           </w:p>
         </w:tc>
@@ -2615,7 +2507,7 @@
                 <w:color w:val="475569"/>
                 <w:sz w:val="18"/>
               </w:rPr>
-              <w:t>Totalmente. O sistema segue as diretrizes da LGPD: senhas protegidas com criptografia forte, separação rigorosa de perfis (recepção não lê prontuário) e trilha de auditoria inviolável.</w:t>
+              <w:t>O projeto acadêmico serviu para validar o rigor de engenharia com 23 testes automatizados. Para operar no seu consultório, o sistema consome servidores profissionais, rotinas diárias de backup e suporte técnico dedicado, garantindo que os dados dos seus pacientes estejam 100% seguros na LGPD.</w:t>
             </w:r>
           </w:p>
         </w:tc>
@@ -2639,7 +2531,7 @@
                 <w:color w:val="0F172A"/>
                 <w:sz w:val="18"/>
               </w:rPr>
-              <w:t>Já posso começar a usar hoje mesmo?</w:t>
+              <w:t>E se a internet cair durante o atendimento?</w:t>
             </w:r>
           </w:p>
         </w:tc>
@@ -2660,7 +2552,7 @@
                 <w:color w:val="475569"/>
                 <w:sz w:val="18"/>
               </w:rPr>
-              <w:t>As telas e regras de negócio já estão 100% operacionais como você viu. Estamos concluindo a infraestrutura de banco de dados na nuvem com backup diário automático para garantir máxima segurança aos seus pacientes. Nosso cronograma prevê a liberação do piloto nas próximas semanas.</w:t>
+              <w:t>O sistema é leve e opera com cache local seguro no navegador. Em caso de oscilações breves, seus dados na tela permanecem preservados.</w:t>
             </w:r>
           </w:p>
         </w:tc>
@@ -2684,7 +2576,7 @@
                 <w:color w:val="0F172A"/>
                 <w:sz w:val="18"/>
               </w:rPr>
-              <w:t>O sistema emite nota fiscal ou faz teleconsulta?</w:t>
+              <w:t>Consigo acessar pelo celular ou tablet?</w:t>
             </w:r>
           </w:p>
         </w:tc>
@@ -2705,7 +2597,52 @@
                 <w:color w:val="475569"/>
                 <w:sz w:val="18"/>
               </w:rPr>
-              <w:t>Essas funcionalidades estão planejadas no nosso roadmap de expansão. Esse contato com você é ideal justamente para mapearmos as prioridades da sua clínica e incluirmos nos próximos lançamentos.</w:t>
+              <w:t>Sim! A interface é 100% responsiva. Você pode consultar a agenda ou prontuários tanto no computador do consultório quanto no celular.</w:t>
+            </w:r>
+          </w:p>
+        </w:tc>
+      </w:tr>
+      <w:tr>
+        <w:tc>
+          <w:tcPr>
+            <w:tcW w:type="dxa" w:w="3600"/>
+            <w:shd w:fill="FFFFFF"/>
+            <w:tcMar>
+              <w:top w:w="80" w:type="dxa"/>
+              <w:bottom w:w="80" w:type="dxa"/>
+              <w:left w:w="100" w:type="dxa"/>
+              <w:right w:w="100" w:type="dxa"/>
+            </w:tcMar>
+          </w:tcPr>
+          <w:p>
+            <w:r>
+              <w:rPr>
+                <w:b/>
+                <w:color w:val="0F172A"/>
+                <w:sz w:val="18"/>
+              </w:rPr>
+              <w:t>E se der algum problema ou bug no sistema?</w:t>
+            </w:r>
+          </w:p>
+        </w:tc>
+        <w:tc>
+          <w:tcPr>
+            <w:tcW w:type="dxa" w:w="6192"/>
+            <w:shd w:fill="FFFFFF"/>
+            <w:tcMar>
+              <w:top w:w="80" w:type="dxa"/>
+              <w:bottom w:w="80" w:type="dxa"/>
+              <w:left w:w="100" w:type="dxa"/>
+              <w:right w:w="100" w:type="dxa"/>
+            </w:tcMar>
+          </w:tcPr>
+          <w:p>
+            <w:r>
+              <w:rPr>
+                <w:color w:val="475569"/>
+                <w:sz w:val="18"/>
+              </w:rPr>
+              <w:t>No modelo de projeto fechado, você conta com 90 dias de garantia técnica com correção prioritária sem custo. No modelo de assinatura, essa garantia e suporte são permanentes enquanto o plano estiver ativo.</w:t>
             </w:r>
           </w:p>
         </w:tc>
@@ -2731,19 +2668,6 @@
         <w:t>9. Anexo: Resumo Rápido para a Reunião (Guia de Bolso)</w:t>
       </w:r>
     </w:p>
-    <w:p>
-      <w:pPr>
-        <w:spacing w:after="80" w:line="276" w:lineRule="auto"/>
-      </w:pPr>
-      <w:r>
-        <w:rPr>
-          <w:rFonts w:ascii="Calibri" w:hAnsi="Calibri"/>
-          <w:color w:val="0F172A"/>
-          <w:sz w:val="20"/>
-        </w:rPr>
-        <w:t>Consulte esta tabela rápida em uma segunda tela durante a apresentação para manter o ritmo perfeito:</w:t>
-      </w:r>
-    </w:p>
     <w:tbl>
       <w:tblPr>
         <w:tblW w:type="auto" w:w="0"/>
@@ -2752,9 +2676,9 @@
         <w:tblLook w:firstColumn="1" w:firstRow="1" w:lastColumn="0" w:lastRow="0" w:noHBand="0" w:noVBand="1" w:val="04A0"/>
       </w:tblPr>
       <w:tblGrid>
-        <w:gridCol w:w="3216"/>
-        <w:gridCol w:w="3216"/>
-        <w:gridCol w:w="3216"/>
+        <w:gridCol w:w="3264"/>
+        <w:gridCol w:w="3264"/>
+        <w:gridCol w:w="3264"/>
       </w:tblGrid>
       <w:tr>
         <w:tc>
@@ -3360,7 +3284,7 @@
                 <w:color w:val="475569"/>
                 <w:sz w:val="18"/>
               </w:rPr>
-              <w:t>Apresentar os 23 testes unitários TDD xUnit aprovados e próximos passos.</w:t>
+              <w:t>Apresentar os 23 testes unitários TDD xUnit aprovados e maturidade técnica.</w:t>
             </w:r>
           </w:p>
         </w:tc>
@@ -3412,7 +3336,7 @@
                 <w:color w:val="0F172A"/>
                 <w:sz w:val="18"/>
               </w:rPr>
-              <w:t>Fechamento &amp; Proposta</w:t>
+              <w:t>Apresentação das Duas Portas &amp; Fechamento</w:t>
             </w:r>
           </w:p>
         </w:tc>
@@ -3436,7 +3360,7 @@
                 <w:color w:val="475569"/>
                 <w:sz w:val="18"/>
               </w:rPr>
-              <w:t>Coletar impressões da cliente e propor início de piloto de 15 dias.</w:t>
+              <w:t>Oferecer Opção 1 (SaaS R$ 119/mês) vs Opção 2 (Projeto R$ 2.400) -&gt; Conduzir p/ Piloto 30d.</w:t>
             </w:r>
           </w:p>
         </w:tc>
@@ -3446,7 +3370,7 @@
       <w:headerReference w:type="default" r:id="rId9"/>
       <w:footerReference w:type="default" r:id="rId10"/>
       <w:pgSz w:w="12240" w:h="15840"/>
-      <w:pgMar w:top="1296" w:right="1296" w:bottom="1296" w:left="1296" w:header="720" w:footer="720" w:gutter="0"/>
+      <w:pgMar w:top="1224" w:right="1224" w:bottom="1224" w:left="1224" w:header="720" w:footer="720" w:gutter="0"/>
       <w:cols w:space="720"/>
       <w:docGrid w:linePitch="360"/>
     </w:sectPr>
@@ -3476,7 +3400,7 @@
       <w:jc w:val="right"/>
     </w:pPr>
     <w:r>
-      <w:t>Clinix • Roteiro de Apresentação do Sistema para Clínicas e Consultórios</w:t>
+      <w:t>Clinix • Roteiro de Apresentação e Fechamento com a Cliente</w:t>
     </w:r>
   </w:p>
 </w:hdr>

</xml_diff>